<commit_message>
Login & signup Authentication Fixes
</commit_message>
<xml_diff>
--- a/WFX-AI-ERP-Technical-Documentation.docx
+++ b/WFX-AI-ERP-Technical-Documentation.docx
@@ -1630,20 +1630,30 @@
                 <w:sz w:val="19"/>
                 <w:szCs w:val="19"/>
               </w:rPr>
-              <w:t>Generates 512-dimensional vector embeddings for text and image files using the clip-vit-base-patch32 model.</w:t>
+              <w:t xml:space="preserve">Generates 512-dimensional vector embeddings locally in-process for text and images using the </w:t>
+            </w:r>
+            <w:proofErr w:type="spellStart"/>
+            <w:r>
+              <w:rPr>
+                <w:color w:val="auto"/>
+                <w:sz w:val="19"/>
+                <w:szCs w:val="19"/>
+              </w:rPr>
+              <w:t>Xenova</w:t>
+            </w:r>
+            <w:proofErr w:type="spellEnd"/>
+            <w:r>
+              <w:rPr>
+                <w:color w:val="auto"/>
+                <w:sz w:val="19"/>
+                <w:szCs w:val="19"/>
+              </w:rPr>
+              <w:t xml:space="preserve"> clip-vit-base-patch32 model.</w:t>
             </w:r>
           </w:p>
         </w:tc>
       </w:tr>
     </w:tbl>
-    <w:p>
-      <w:pPr>
-        <w:spacing w:after="200"/>
-        <w:rPr>
-          <w:color w:val="auto"/>
-        </w:rPr>
-      </w:pPr>
-    </w:p>
     <w:p>
       <w:pPr>
         <w:pStyle w:val="Heading2"/>
@@ -1941,28 +1951,8 @@
       <w:r>
         <w:rPr>
           <w:color w:val="auto"/>
-          <w:sz w:val="20"/>
-          <w:szCs w:val="20"/>
-        </w:rPr>
-        <w:t xml:space="preserve">Backend routes the input to </w:t>
-      </w:r>
-      <w:proofErr w:type="spellStart"/>
-      <w:r>
-        <w:rPr>
-          <w:color w:val="auto"/>
-          <w:sz w:val="20"/>
-          <w:szCs w:val="20"/>
-        </w:rPr>
-        <w:t>HuggingFace</w:t>
-      </w:r>
-      <w:proofErr w:type="spellEnd"/>
-      <w:r>
-        <w:rPr>
-          <w:color w:val="auto"/>
-          <w:sz w:val="20"/>
-          <w:szCs w:val="20"/>
-        </w:rPr>
-        <w:t xml:space="preserve"> CLIP to generate a 512-dimensional embedding.</w:t>
+        </w:rPr>
+        <w:t>Backend processes the input locally using Transformers.js (CLIP) to generate a 512-dimensional embedding.</w:t>
       </w:r>
     </w:p>
     <w:p>
@@ -2400,6 +2390,20 @@
                 <w:szCs w:val="19"/>
               </w:rPr>
               <w:t>Deploy the Express server. Add environment variables: SUPABASE_URL, SUPABASE_KEY, JWT_SECRET, OPENROUTER_API_KEY, HUGGINGFACE_TOKEN.</w:t>
+            </w:r>
+            <w:r>
+              <w:rPr>
+                <w:color w:val="auto"/>
+                <w:sz w:val="19"/>
+                <w:szCs w:val="19"/>
+              </w:rPr>
+              <w:br/>
+            </w:r>
+            <w:r>
+              <w:rPr>
+                <w:color w:val="auto"/>
+              </w:rPr>
+              <w:t>Used solely by Transformers.js to authenticate model downloads from Hugging Face Hub during server startup.</w:t>
             </w:r>
           </w:p>
         </w:tc>
@@ -6191,14 +6195,16 @@
               </w:rPr>
               <w:t xml:space="preserve">Cache frequently </w:t>
             </w:r>
-            <w:r>
-              <w:rPr>
-                <w:color w:val="auto"/>
-                <w:sz w:val="19"/>
-                <w:szCs w:val="19"/>
-              </w:rPr>
-              <w:t>runs</w:t>
-            </w:r>
+            <w:proofErr w:type="gramStart"/>
+            <w:r>
+              <w:rPr>
+                <w:color w:val="auto"/>
+                <w:sz w:val="19"/>
+                <w:szCs w:val="19"/>
+              </w:rPr>
+              <w:t>run</w:t>
+            </w:r>
+            <w:proofErr w:type="gramEnd"/>
             <w:r>
               <w:rPr>
                 <w:color w:val="auto"/>
@@ -7148,7 +7154,6 @@
   <w:style w:type="character" w:default="1" w:styleId="DefaultParagraphFont">
     <w:name w:val="Default Paragraph Font"/>
     <w:uiPriority w:val="1"/>
-    <w:semiHidden/>
     <w:unhideWhenUsed/>
   </w:style>
   <w:style w:type="table" w:default="1" w:styleId="TableNormal">

</xml_diff>